<commit_message>
Add Certificate Course in Market Research and market research competencies across resume (MD, DOCX, PDF) and README
</commit_message>
<xml_diff>
--- a/Kartik_Tripathi_Resume.docx
+++ b/Kartik_Tripathi_Resume.docx
@@ -4,12 +4,11 @@
   <w:body>
     <w:p>
       <w:pPr>
-        <w:spacing w:after="40" w:before="0"/>
+        <w:spacing w:before="0" w:after="20"/>
         <w:jc w:val="center"/>
       </w:pPr>
       <w:r>
         <w:rPr>
-          <w:rFonts w:ascii="Calibri" w:hAnsi="Calibri"/>
           <w:b/>
           <w:color w:val="0F2C59"/>
           <w:sz w:val="34"/>
@@ -19,44 +18,40 @@
     </w:p>
     <w:p>
       <w:pPr>
-        <w:spacing w:after="60" w:before="0"/>
+        <w:spacing w:before="0" w:after="30"/>
         <w:jc w:val="center"/>
       </w:pPr>
       <w:r>
         <w:rPr>
-          <w:rFonts w:ascii="Calibri" w:hAnsi="Calibri"/>
           <w:b/>
-          <w:color w:val="464646"/>
-          <w:sz w:val="21"/>
+          <w:color w:val="1E1E1E"/>
+          <w:sz w:val="19"/>
         </w:rPr>
         <w:t>DATA ANALYST &amp; BUSINESS INTELLIGENCE DEVELOPER</w:t>
       </w:r>
     </w:p>
     <w:p>
       <w:pPr>
-        <w:spacing w:after="120" w:before="0"/>
+        <w:spacing w:before="0" w:after="80"/>
         <w:jc w:val="center"/>
       </w:pPr>
       <w:r>
         <w:rPr>
-          <w:rFonts w:ascii="Calibri" w:hAnsi="Calibri"/>
           <w:color w:val="464646"/>
-          <w:sz w:val="18"/>
+          <w:sz w:val="17"/>
         </w:rPr>
         <w:t>Nainital, Uttarakhand, India  |  +91 70172 69349  |  ktkartik1234@gmail.com  |  linkedin.com/in/kartik-tripathi-725697383  |  github.com/ktkartik1234-lgtm</w:t>
       </w:r>
     </w:p>
     <w:p>
       <w:pPr>
-        <w:keepNext/>
-        <w:spacing w:before="120" w:after="40"/>
-        <w:pBrd>
-          <w:bottom w:val="single" w:sz="8" w:space="2" w:color="0F2C59"/>
-        </w:pBrd>
+        <w:spacing w:before="160" w:after="40"/>
+        <w:pBdr>
+          <w:bottom w:val="single" w:sz="6" w:space="1" w:color="0F2C59"/>
+        </w:pBdr>
       </w:pPr>
       <w:r>
         <w:rPr>
-          <w:rFonts w:ascii="Calibri" w:hAnsi="Calibri"/>
           <w:b/>
           <w:color w:val="0F2C59"/>
           <w:sz w:val="21"/>
@@ -66,28 +61,24 @@
     </w:p>
     <w:p>
       <w:pPr>
-        <w:spacing w:before="40" w:after="60"/>
+        <w:spacing w:before="40" w:after="80" w:line="269" w:lineRule="auto"/>
       </w:pPr>
       <w:r>
         <w:rPr>
-          <w:rFonts w:ascii="Calibri" w:hAnsi="Calibri"/>
-          <w:color w:val="1E1E1E"/>
           <w:sz w:val="19"/>
         </w:rPr>
-        <w:t>Analytical and results-driven Data Analyst &amp; BI Developer with a strong quantitative foundation (B.Sc. in Physics, Chemistry, &amp; Mathematics) and professional certification in Data Analytics with GenAI. Proven expertise in SQL database architecture (3NF / Star Schema), Python data analytics pipelines (Pandas, NumPy, SciPy), inferential statistical modeling, and executive dashboard engineering using Power BI and Tableau. Adept at translating multi-million row transactional datasets into actionable commercial insights, predictive customer segmentation (RFM), and interactive business intelligence solutions for cross-functional stakeholders.</w:t>
+        <w:t>Analytical and results-driven Data Analyst &amp; BI Developer with a strong quantitative foundation (B.Sc. in Physics, Chemistry, &amp; Mathematics) and professional certifications in Data Analytics with GenAI and Market Research. Proven expertise in SQL database architecture (3NF / Star Schema), Python data analytics pipelines (Pandas, NumPy, SciPy), inferential statistical modeling, market research &amp; consumer insights, and executive dashboard engineering using Power BI and Tableau. Adept at translating multi-million row transactional datasets into actionable commercial insights, predictive customer segmentation (RFM), and interactive business intelligence solutions for cross-functional stakeholders.</w:t>
       </w:r>
     </w:p>
     <w:p>
       <w:pPr>
-        <w:keepNext/>
-        <w:spacing w:before="120" w:after="40"/>
-        <w:pBrd>
-          <w:bottom w:val="single" w:sz="8" w:space="2" w:color="0F2C59"/>
-        </w:pBrd>
+        <w:spacing w:before="160" w:after="40"/>
+        <w:pBdr>
+          <w:bottom w:val="single" w:sz="6" w:space="1" w:color="0F2C59"/>
+        </w:pBdr>
       </w:pPr>
       <w:r>
         <w:rPr>
-          <w:rFonts w:ascii="Calibri" w:hAnsi="Calibri"/>
           <w:b/>
           <w:color w:val="0F2C59"/>
           <w:sz w:val="21"/>
@@ -97,13 +88,10 @@
     </w:p>
     <w:p>
       <w:pPr>
-        <w:pStyle w:val="ListBullet"/>
-        <w:spacing w:before="20" w:after="30"/>
-        <w:ind w:left="288"/>
+        <w:spacing w:before="30" w:after="30" w:line="259" w:lineRule="auto"/>
       </w:pPr>
       <w:r>
         <w:rPr>
-          <w:rFonts w:ascii="Calibri" w:hAnsi="Calibri"/>
           <w:b/>
           <w:color w:val="1E1E1E"/>
           <w:sz w:val="19"/>
@@ -112,8 +100,6 @@
       </w:r>
       <w:r>
         <w:rPr>
-          <w:rFonts w:ascii="Calibri" w:hAnsi="Calibri"/>
-          <w:color w:val="1E1E1E"/>
           <w:sz w:val="19"/>
         </w:rPr>
         <w:t>PostgreSQL, MySQL, SQLite, Relational Schema Normalization (3NF), Star Schema, Dimensional Modeling, Window Functions (ROW_NUMBER, RANK), CTEs, Multi-Table Joins, Correlated Subqueries (EXISTS/NOT EXISTS), Indexing &amp; Constraints.</w:t>
@@ -121,13 +107,10 @@
     </w:p>
     <w:p>
       <w:pPr>
-        <w:pStyle w:val="ListBullet"/>
-        <w:spacing w:before="20" w:after="30"/>
-        <w:ind w:left="288"/>
+        <w:spacing w:before="30" w:after="30" w:line="259" w:lineRule="auto"/>
       </w:pPr>
       <w:r>
         <w:rPr>
-          <w:rFonts w:ascii="Calibri" w:hAnsi="Calibri"/>
           <w:b/>
           <w:color w:val="1E1E1E"/>
           <w:sz w:val="19"/>
@@ -136,8 +119,6 @@
       </w:r>
       <w:r>
         <w:rPr>
-          <w:rFonts w:ascii="Calibri" w:hAnsi="Calibri"/>
-          <w:color w:val="1E1E1E"/>
           <w:sz w:val="19"/>
         </w:rPr>
         <w:t>Pandas, NumPy, SciPy, Matplotlib, Seaborn, Flask, Jupyter Notebooks, Data Cleansing, ETL Pipelines, Generative AI &amp; Prompt Engineering.</w:t>
@@ -145,13 +126,10 @@
     </w:p>
     <w:p>
       <w:pPr>
-        <w:pStyle w:val="ListBullet"/>
-        <w:spacing w:before="20" w:after="30"/>
-        <w:ind w:left="288"/>
+        <w:spacing w:before="30" w:after="30" w:line="259" w:lineRule="auto"/>
       </w:pPr>
       <w:r>
         <w:rPr>
-          <w:rFonts w:ascii="Calibri" w:hAnsi="Calibri"/>
           <w:b/>
           <w:color w:val="1E1E1E"/>
           <w:sz w:val="19"/>
@@ -160,8 +138,6 @@
       </w:r>
       <w:r>
         <w:rPr>
-          <w:rFonts w:ascii="Calibri" w:hAnsi="Calibri"/>
-          <w:color w:val="1E1E1E"/>
           <w:sz w:val="19"/>
         </w:rPr>
         <w:t>Microsoft Power BI (DAX Measures, Power Query ETL, Star Schema Modeling, Interactive Dashboards), Tableau Desktop (Calculated Fields, FIXED LOD Expressions, GIS Mapping), Advanced Excel (Pivot Tables, Dynamic Slicers, XLOOKUP, Nested Formulas, Variance Modeling).</w:t>
@@ -169,39 +145,32 @@
     </w:p>
     <w:p>
       <w:pPr>
-        <w:pStyle w:val="ListBullet"/>
-        <w:spacing w:before="20" w:after="30"/>
-        <w:ind w:left="288"/>
+        <w:spacing w:before="30" w:after="30" w:line="259" w:lineRule="auto"/>
       </w:pPr>
       <w:r>
         <w:rPr>
-          <w:rFonts w:ascii="Calibri" w:hAnsi="Calibri"/>
           <w:b/>
           <w:color w:val="1E1E1E"/>
           <w:sz w:val="19"/>
         </w:rPr>
-        <w:t xml:space="preserve">Statistical Modeling &amp; Commercial Analytics: </w:t>
+        <w:t xml:space="preserve">Statistical Modeling &amp; Market Research: </w:t>
       </w:r>
       <w:r>
         <w:rPr>
-          <w:rFonts w:ascii="Calibri" w:hAnsi="Calibri"/>
-          <w:color w:val="1E1E1E"/>
           <w:sz w:val="19"/>
         </w:rPr>
-        <w:t>Inferential Statistics, Hypothesis Testing (Welch's t-Test, ANOVA, Chi-Square, Pearson r), RFM Customer Segmentation, Pareto (80/20) Decile Modeling, KPI Definition, Revenue &amp; Margin Variance Analysis.</w:t>
+        <w:t>Inferential Statistics, Hypothesis Testing (Welch's t-Test, ANOVA, Chi-Square, Pearson r), RFM Customer Segmentation, Pareto (80/20) Decile Modeling, Market Research &amp; Sizing, Consumer Insights, Survey Design &amp; Sampling, Competitor Analysis, KPI Definition, Revenue &amp; Margin Variance Analysis.</w:t>
       </w:r>
     </w:p>
     <w:p>
       <w:pPr>
-        <w:keepNext/>
-        <w:spacing w:before="120" w:after="40"/>
-        <w:pBrd>
-          <w:bottom w:val="single" w:sz="8" w:space="2" w:color="0F2C59"/>
-        </w:pBrd>
+        <w:spacing w:before="160" w:after="40"/>
+        <w:pBdr>
+          <w:bottom w:val="single" w:sz="6" w:space="1" w:color="0F2C59"/>
+        </w:pBdr>
       </w:pPr>
       <w:r>
         <w:rPr>
-          <w:rFonts w:ascii="Calibri" w:hAnsi="Calibri"/>
           <w:b/>
           <w:color w:val="0F2C59"/>
           <w:sz w:val="21"/>
@@ -211,12 +180,10 @@
     </w:p>
     <w:p>
       <w:pPr>
-        <w:keepNext/>
         <w:spacing w:before="80" w:after="20"/>
       </w:pPr>
       <w:r>
         <w:rPr>
-          <w:rFonts w:ascii="Calibri" w:hAnsi="Calibri"/>
           <w:b/>
           <w:color w:val="1E1E1E"/>
           <w:sz w:val="20"/>
@@ -226,12 +193,10 @@
     </w:p>
     <w:p>
       <w:pPr>
-        <w:keepNext/>
-        <w:spacing w:before="0" w:after="40"/>
+        <w:spacing w:before="0" w:after="30"/>
       </w:pPr>
       <w:r>
         <w:rPr>
-          <w:rFonts w:ascii="Calibri" w:hAnsi="Calibri"/>
           <w:i/>
           <w:color w:val="464646"/>
           <w:sz w:val="17"/>
@@ -242,12 +207,10 @@
     <w:p>
       <w:pPr>
         <w:pStyle w:val="ListBullet"/>
-        <w:spacing w:before="20" w:after="30"/>
-        <w:ind w:left="288"/>
+        <w:spacing w:before="20" w:after="30" w:line="259" w:lineRule="auto"/>
       </w:pPr>
       <w:r>
         <w:rPr>
-          <w:rFonts w:ascii="Calibri" w:hAnsi="Calibri"/>
           <w:b/>
           <w:color w:val="1E1E1E"/>
           <w:sz w:val="19"/>
@@ -256,7 +219,6 @@
       </w:r>
       <w:r>
         <w:rPr>
-          <w:rFonts w:ascii="Calibri" w:hAnsi="Calibri"/>
           <w:color w:val="1E1E1E"/>
           <w:sz w:val="19"/>
         </w:rPr>
@@ -266,12 +228,10 @@
     <w:p>
       <w:pPr>
         <w:pStyle w:val="ListBullet"/>
-        <w:spacing w:before="20" w:after="30"/>
-        <w:ind w:left="288"/>
+        <w:spacing w:before="20" w:after="30" w:line="259" w:lineRule="auto"/>
       </w:pPr>
       <w:r>
         <w:rPr>
-          <w:rFonts w:ascii="Calibri" w:hAnsi="Calibri"/>
           <w:b/>
           <w:color w:val="1E1E1E"/>
           <w:sz w:val="19"/>
@@ -280,7 +240,6 @@
       </w:r>
       <w:r>
         <w:rPr>
-          <w:rFonts w:ascii="Calibri" w:hAnsi="Calibri"/>
           <w:color w:val="1E1E1E"/>
           <w:sz w:val="19"/>
         </w:rPr>
@@ -290,12 +249,10 @@
     <w:p>
       <w:pPr>
         <w:pStyle w:val="ListBullet"/>
-        <w:spacing w:before="20" w:after="30"/>
-        <w:ind w:left="288"/>
+        <w:spacing w:before="20" w:after="30" w:line="259" w:lineRule="auto"/>
       </w:pPr>
       <w:r>
         <w:rPr>
-          <w:rFonts w:ascii="Calibri" w:hAnsi="Calibri"/>
           <w:b/>
           <w:color w:val="1E1E1E"/>
           <w:sz w:val="19"/>
@@ -304,7 +261,6 @@
       </w:r>
       <w:r>
         <w:rPr>
-          <w:rFonts w:ascii="Calibri" w:hAnsi="Calibri"/>
           <w:color w:val="1E1E1E"/>
           <w:sz w:val="19"/>
         </w:rPr>
@@ -314,12 +270,10 @@
     <w:p>
       <w:pPr>
         <w:pStyle w:val="ListBullet"/>
-        <w:spacing w:before="20" w:after="30"/>
-        <w:ind w:left="288"/>
+        <w:spacing w:before="20" w:after="30" w:line="259" w:lineRule="auto"/>
       </w:pPr>
       <w:r>
         <w:rPr>
-          <w:rFonts w:ascii="Calibri" w:hAnsi="Calibri"/>
           <w:b/>
           <w:color w:val="1E1E1E"/>
           <w:sz w:val="19"/>
@@ -328,7 +282,6 @@
       </w:r>
       <w:r>
         <w:rPr>
-          <w:rFonts w:ascii="Calibri" w:hAnsi="Calibri"/>
           <w:color w:val="1E1E1E"/>
           <w:sz w:val="19"/>
         </w:rPr>
@@ -337,12 +290,10 @@
     </w:p>
     <w:p>
       <w:pPr>
-        <w:keepNext/>
         <w:spacing w:before="80" w:after="20"/>
       </w:pPr>
       <w:r>
         <w:rPr>
-          <w:rFonts w:ascii="Calibri" w:hAnsi="Calibri"/>
           <w:b/>
           <w:color w:val="1E1E1E"/>
           <w:sz w:val="20"/>
@@ -352,12 +303,10 @@
     </w:p>
     <w:p>
       <w:pPr>
-        <w:keepNext/>
-        <w:spacing w:before="0" w:after="40"/>
+        <w:spacing w:before="0" w:after="30"/>
       </w:pPr>
       <w:r>
         <w:rPr>
-          <w:rFonts w:ascii="Calibri" w:hAnsi="Calibri"/>
           <w:i/>
           <w:color w:val="464646"/>
           <w:sz w:val="17"/>
@@ -368,12 +317,10 @@
     <w:p>
       <w:pPr>
         <w:pStyle w:val="ListBullet"/>
-        <w:spacing w:before="20" w:after="30"/>
-        <w:ind w:left="288"/>
+        <w:spacing w:before="20" w:after="30" w:line="259" w:lineRule="auto"/>
       </w:pPr>
       <w:r>
         <w:rPr>
-          <w:rFonts w:ascii="Calibri" w:hAnsi="Calibri"/>
           <w:b/>
           <w:color w:val="1E1E1E"/>
           <w:sz w:val="19"/>
@@ -382,7 +329,6 @@
       </w:r>
       <w:r>
         <w:rPr>
-          <w:rFonts w:ascii="Calibri" w:hAnsi="Calibri"/>
           <w:color w:val="1E1E1E"/>
           <w:sz w:val="19"/>
         </w:rPr>
@@ -392,12 +338,10 @@
     <w:p>
       <w:pPr>
         <w:pStyle w:val="ListBullet"/>
-        <w:spacing w:before="20" w:after="30"/>
-        <w:ind w:left="288"/>
+        <w:spacing w:before="20" w:after="30" w:line="259" w:lineRule="auto"/>
       </w:pPr>
       <w:r>
         <w:rPr>
-          <w:rFonts w:ascii="Calibri" w:hAnsi="Calibri"/>
           <w:b/>
           <w:color w:val="1E1E1E"/>
           <w:sz w:val="19"/>
@@ -406,7 +350,6 @@
       </w:r>
       <w:r>
         <w:rPr>
-          <w:rFonts w:ascii="Calibri" w:hAnsi="Calibri"/>
           <w:color w:val="1E1E1E"/>
           <w:sz w:val="19"/>
         </w:rPr>
@@ -416,12 +359,10 @@
     <w:p>
       <w:pPr>
         <w:pStyle w:val="ListBullet"/>
-        <w:spacing w:before="20" w:after="30"/>
-        <w:ind w:left="288"/>
+        <w:spacing w:before="20" w:after="30" w:line="259" w:lineRule="auto"/>
       </w:pPr>
       <w:r>
         <w:rPr>
-          <w:rFonts w:ascii="Calibri" w:hAnsi="Calibri"/>
           <w:b/>
           <w:color w:val="1E1E1E"/>
           <w:sz w:val="19"/>
@@ -430,7 +371,6 @@
       </w:r>
       <w:r>
         <w:rPr>
-          <w:rFonts w:ascii="Calibri" w:hAnsi="Calibri"/>
           <w:color w:val="1E1E1E"/>
           <w:sz w:val="19"/>
         </w:rPr>
@@ -440,12 +380,10 @@
     <w:p>
       <w:pPr>
         <w:pStyle w:val="ListBullet"/>
-        <w:spacing w:before="20" w:after="30"/>
-        <w:ind w:left="288"/>
+        <w:spacing w:before="20" w:after="30" w:line="259" w:lineRule="auto"/>
       </w:pPr>
       <w:r>
         <w:rPr>
-          <w:rFonts w:ascii="Calibri" w:hAnsi="Calibri"/>
           <w:b/>
           <w:color w:val="1E1E1E"/>
           <w:sz w:val="19"/>
@@ -454,7 +392,6 @@
       </w:r>
       <w:r>
         <w:rPr>
-          <w:rFonts w:ascii="Calibri" w:hAnsi="Calibri"/>
           <w:color w:val="1E1E1E"/>
           <w:sz w:val="19"/>
         </w:rPr>
@@ -463,12 +400,10 @@
     </w:p>
     <w:p>
       <w:pPr>
-        <w:keepNext/>
         <w:spacing w:before="80" w:after="20"/>
       </w:pPr>
       <w:r>
         <w:rPr>
-          <w:rFonts w:ascii="Calibri" w:hAnsi="Calibri"/>
           <w:b/>
           <w:color w:val="1E1E1E"/>
           <w:sz w:val="20"/>
@@ -478,12 +413,10 @@
     </w:p>
     <w:p>
       <w:pPr>
-        <w:keepNext/>
-        <w:spacing w:before="0" w:after="40"/>
+        <w:spacing w:before="0" w:after="30"/>
       </w:pPr>
       <w:r>
         <w:rPr>
-          <w:rFonts w:ascii="Calibri" w:hAnsi="Calibri"/>
           <w:i/>
           <w:color w:val="464646"/>
           <w:sz w:val="17"/>
@@ -494,12 +427,10 @@
     <w:p>
       <w:pPr>
         <w:pStyle w:val="ListBullet"/>
-        <w:spacing w:before="20" w:after="30"/>
-        <w:ind w:left="288"/>
+        <w:spacing w:before="20" w:after="30" w:line="259" w:lineRule="auto"/>
       </w:pPr>
       <w:r>
         <w:rPr>
-          <w:rFonts w:ascii="Calibri" w:hAnsi="Calibri"/>
           <w:b/>
           <w:color w:val="1E1E1E"/>
           <w:sz w:val="19"/>
@@ -508,7 +439,6 @@
       </w:r>
       <w:r>
         <w:rPr>
-          <w:rFonts w:ascii="Calibri" w:hAnsi="Calibri"/>
           <w:color w:val="1E1E1E"/>
           <w:sz w:val="19"/>
         </w:rPr>
@@ -518,12 +448,10 @@
     <w:p>
       <w:pPr>
         <w:pStyle w:val="ListBullet"/>
-        <w:spacing w:before="20" w:after="30"/>
-        <w:ind w:left="288"/>
+        <w:spacing w:before="20" w:after="30" w:line="259" w:lineRule="auto"/>
       </w:pPr>
       <w:r>
         <w:rPr>
-          <w:rFonts w:ascii="Calibri" w:hAnsi="Calibri"/>
           <w:b/>
           <w:color w:val="1E1E1E"/>
           <w:sz w:val="19"/>
@@ -532,7 +460,6 @@
       </w:r>
       <w:r>
         <w:rPr>
-          <w:rFonts w:ascii="Calibri" w:hAnsi="Calibri"/>
           <w:color w:val="1E1E1E"/>
           <w:sz w:val="19"/>
         </w:rPr>
@@ -542,12 +469,10 @@
     <w:p>
       <w:pPr>
         <w:pStyle w:val="ListBullet"/>
-        <w:spacing w:before="20" w:after="30"/>
-        <w:ind w:left="288"/>
+        <w:spacing w:before="20" w:after="30" w:line="259" w:lineRule="auto"/>
       </w:pPr>
       <w:r>
         <w:rPr>
-          <w:rFonts w:ascii="Calibri" w:hAnsi="Calibri"/>
           <w:b/>
           <w:color w:val="1E1E1E"/>
           <w:sz w:val="19"/>
@@ -556,7 +481,6 @@
       </w:r>
       <w:r>
         <w:rPr>
-          <w:rFonts w:ascii="Calibri" w:hAnsi="Calibri"/>
           <w:color w:val="1E1E1E"/>
           <w:sz w:val="19"/>
         </w:rPr>
@@ -565,12 +489,10 @@
     </w:p>
     <w:p>
       <w:pPr>
-        <w:keepNext/>
         <w:spacing w:before="80" w:after="20"/>
       </w:pPr>
       <w:r>
         <w:rPr>
-          <w:rFonts w:ascii="Calibri" w:hAnsi="Calibri"/>
           <w:b/>
           <w:color w:val="1E1E1E"/>
           <w:sz w:val="20"/>
@@ -580,12 +502,10 @@
     </w:p>
     <w:p>
       <w:pPr>
-        <w:keepNext/>
-        <w:spacing w:before="0" w:after="40"/>
+        <w:spacing w:before="0" w:after="30"/>
       </w:pPr>
       <w:r>
         <w:rPr>
-          <w:rFonts w:ascii="Calibri" w:hAnsi="Calibri"/>
           <w:i/>
           <w:color w:val="464646"/>
           <w:sz w:val="17"/>
@@ -596,12 +516,10 @@
     <w:p>
       <w:pPr>
         <w:pStyle w:val="ListBullet"/>
-        <w:spacing w:before="20" w:after="30"/>
-        <w:ind w:left="288"/>
+        <w:spacing w:before="20" w:after="30" w:line="259" w:lineRule="auto"/>
       </w:pPr>
       <w:r>
         <w:rPr>
-          <w:rFonts w:ascii="Calibri" w:hAnsi="Calibri"/>
           <w:b/>
           <w:color w:val="1E1E1E"/>
           <w:sz w:val="19"/>
@@ -610,7 +528,6 @@
       </w:r>
       <w:r>
         <w:rPr>
-          <w:rFonts w:ascii="Calibri" w:hAnsi="Calibri"/>
           <w:color w:val="1E1E1E"/>
           <w:sz w:val="19"/>
         </w:rPr>
@@ -620,12 +537,10 @@
     <w:p>
       <w:pPr>
         <w:pStyle w:val="ListBullet"/>
-        <w:spacing w:before="20" w:after="30"/>
-        <w:ind w:left="288"/>
+        <w:spacing w:before="20" w:after="30" w:line="259" w:lineRule="auto"/>
       </w:pPr>
       <w:r>
         <w:rPr>
-          <w:rFonts w:ascii="Calibri" w:hAnsi="Calibri"/>
           <w:b/>
           <w:color w:val="1E1E1E"/>
           <w:sz w:val="19"/>
@@ -634,7 +549,6 @@
       </w:r>
       <w:r>
         <w:rPr>
-          <w:rFonts w:ascii="Calibri" w:hAnsi="Calibri"/>
           <w:color w:val="1E1E1E"/>
           <w:sz w:val="19"/>
         </w:rPr>
@@ -644,12 +558,10 @@
     <w:p>
       <w:pPr>
         <w:pStyle w:val="ListBullet"/>
-        <w:spacing w:before="20" w:after="30"/>
-        <w:ind w:left="288"/>
+        <w:spacing w:before="20" w:after="30" w:line="259" w:lineRule="auto"/>
       </w:pPr>
       <w:r>
         <w:rPr>
-          <w:rFonts w:ascii="Calibri" w:hAnsi="Calibri"/>
           <w:b/>
           <w:color w:val="1E1E1E"/>
           <w:sz w:val="19"/>
@@ -658,7 +570,6 @@
       </w:r>
       <w:r>
         <w:rPr>
-          <w:rFonts w:ascii="Calibri" w:hAnsi="Calibri"/>
           <w:color w:val="1E1E1E"/>
           <w:sz w:val="19"/>
         </w:rPr>
@@ -668,12 +579,10 @@
     <w:p>
       <w:pPr>
         <w:pStyle w:val="ListBullet"/>
-        <w:spacing w:before="20" w:after="30"/>
-        <w:ind w:left="288"/>
+        <w:spacing w:before="20" w:after="30" w:line="259" w:lineRule="auto"/>
       </w:pPr>
       <w:r>
         <w:rPr>
-          <w:rFonts w:ascii="Calibri" w:hAnsi="Calibri"/>
           <w:b/>
           <w:color w:val="1E1E1E"/>
           <w:sz w:val="19"/>
@@ -682,7 +591,6 @@
       </w:r>
       <w:r>
         <w:rPr>
-          <w:rFonts w:ascii="Calibri" w:hAnsi="Calibri"/>
           <w:color w:val="1E1E1E"/>
           <w:sz w:val="19"/>
         </w:rPr>
@@ -691,15 +599,13 @@
     </w:p>
     <w:p>
       <w:pPr>
-        <w:keepNext/>
-        <w:spacing w:before="120" w:after="40"/>
-        <w:pBrd>
-          <w:bottom w:val="single" w:sz="8" w:space="2" w:color="0F2C59"/>
-        </w:pBrd>
+        <w:spacing w:before="160" w:after="40"/>
+        <w:pBdr>
+          <w:bottom w:val="single" w:sz="6" w:space="1" w:color="0F2C59"/>
+        </w:pBdr>
       </w:pPr>
       <w:r>
         <w:rPr>
-          <w:rFonts w:ascii="Calibri" w:hAnsi="Calibri"/>
           <w:b/>
           <w:color w:val="0F2C59"/>
           <w:sz w:val="21"/>
@@ -709,12 +615,10 @@
     </w:p>
     <w:p>
       <w:pPr>
-        <w:keepNext/>
-        <w:spacing w:before="80" w:after="20"/>
+        <w:spacing w:before="60" w:after="20"/>
       </w:pPr>
       <w:r>
         <w:rPr>
-          <w:rFonts w:ascii="Calibri" w:hAnsi="Calibri"/>
           <w:b/>
           <w:color w:val="1E1E1E"/>
           <w:sz w:val="20"/>
@@ -724,12 +628,10 @@
     </w:p>
     <w:p>
       <w:pPr>
-        <w:keepNext/>
-        <w:spacing w:before="0" w:after="40"/>
+        <w:spacing w:before="0" w:after="30"/>
       </w:pPr>
       <w:r>
         <w:rPr>
-          <w:rFonts w:ascii="Calibri" w:hAnsi="Calibri"/>
           <w:i/>
           <w:color w:val="464646"/>
           <w:sz w:val="17"/>
@@ -740,12 +642,10 @@
     <w:p>
       <w:pPr>
         <w:pStyle w:val="ListBullet"/>
-        <w:spacing w:before="20" w:after="30"/>
-        <w:ind w:left="288"/>
+        <w:spacing w:before="20" w:after="30" w:line="259" w:lineRule="auto"/>
       </w:pPr>
       <w:r>
         <w:rPr>
-          <w:rFonts w:ascii="Calibri" w:hAnsi="Calibri"/>
           <w:b/>
           <w:color w:val="1E1E1E"/>
           <w:sz w:val="19"/>
@@ -754,7 +654,6 @@
       </w:r>
       <w:r>
         <w:rPr>
-          <w:rFonts w:ascii="Calibri" w:hAnsi="Calibri"/>
           <w:color w:val="1E1E1E"/>
           <w:sz w:val="19"/>
         </w:rPr>
@@ -764,12 +663,10 @@
     <w:p>
       <w:pPr>
         <w:pStyle w:val="ListBullet"/>
-        <w:spacing w:before="20" w:after="30"/>
-        <w:ind w:left="288"/>
+        <w:spacing w:before="20" w:after="30" w:line="259" w:lineRule="auto"/>
       </w:pPr>
       <w:r>
         <w:rPr>
-          <w:rFonts w:ascii="Calibri" w:hAnsi="Calibri"/>
           <w:b/>
           <w:color w:val="1E1E1E"/>
           <w:sz w:val="19"/>
@@ -778,7 +675,6 @@
       </w:r>
       <w:r>
         <w:rPr>
-          <w:rFonts w:ascii="Calibri" w:hAnsi="Calibri"/>
           <w:color w:val="1E1E1E"/>
           <w:sz w:val="19"/>
         </w:rPr>
@@ -788,12 +684,10 @@
     <w:p>
       <w:pPr>
         <w:pStyle w:val="ListBullet"/>
-        <w:spacing w:before="20" w:after="30"/>
-        <w:ind w:left="288"/>
+        <w:spacing w:before="20" w:after="30" w:line="259" w:lineRule="auto"/>
       </w:pPr>
       <w:r>
         <w:rPr>
-          <w:rFonts w:ascii="Calibri" w:hAnsi="Calibri"/>
           <w:b/>
           <w:color w:val="1E1E1E"/>
           <w:sz w:val="19"/>
@@ -802,7 +696,6 @@
       </w:r>
       <w:r>
         <w:rPr>
-          <w:rFonts w:ascii="Calibri" w:hAnsi="Calibri"/>
           <w:color w:val="1E1E1E"/>
           <w:sz w:val="19"/>
         </w:rPr>
@@ -812,12 +705,10 @@
     <w:p>
       <w:pPr>
         <w:pStyle w:val="ListBullet"/>
-        <w:spacing w:before="20" w:after="30"/>
-        <w:ind w:left="288"/>
+        <w:spacing w:before="20" w:after="30" w:line="259" w:lineRule="auto"/>
       </w:pPr>
       <w:r>
         <w:rPr>
-          <w:rFonts w:ascii="Calibri" w:hAnsi="Calibri"/>
           <w:b/>
           <w:color w:val="1E1E1E"/>
           <w:sz w:val="19"/>
@@ -826,7 +717,6 @@
       </w:r>
       <w:r>
         <w:rPr>
-          <w:rFonts w:ascii="Calibri" w:hAnsi="Calibri"/>
           <w:color w:val="1E1E1E"/>
           <w:sz w:val="19"/>
         </w:rPr>
@@ -835,15 +725,13 @@
     </w:p>
     <w:p>
       <w:pPr>
-        <w:keepNext/>
-        <w:spacing w:before="120" w:after="40"/>
-        <w:pBrd>
-          <w:bottom w:val="single" w:sz="8" w:space="2" w:color="0F2C59"/>
-        </w:pBrd>
+        <w:spacing w:before="160" w:after="40"/>
+        <w:pBdr>
+          <w:bottom w:val="single" w:sz="6" w:space="1" w:color="0F2C59"/>
+        </w:pBdr>
       </w:pPr>
       <w:r>
         <w:rPr>
-          <w:rFonts w:ascii="Calibri" w:hAnsi="Calibri"/>
           <w:b/>
           <w:color w:val="0F2C59"/>
           <w:sz w:val="21"/>
@@ -854,12 +742,10 @@
     <w:p>
       <w:pPr>
         <w:pStyle w:val="ListBullet"/>
-        <w:spacing w:before="20" w:after="30"/>
-        <w:ind w:left="288"/>
+        <w:spacing w:before="20" w:after="30" w:line="259" w:lineRule="auto"/>
       </w:pPr>
       <w:r>
         <w:rPr>
-          <w:rFonts w:ascii="Calibri" w:hAnsi="Calibri"/>
           <w:b/>
           <w:color w:val="1E1E1E"/>
           <w:sz w:val="19"/>
@@ -868,7 +754,6 @@
       </w:r>
       <w:r>
         <w:rPr>
-          <w:rFonts w:ascii="Calibri" w:hAnsi="Calibri"/>
           <w:color w:val="1E1E1E"/>
           <w:sz w:val="19"/>
         </w:rPr>
@@ -878,12 +763,31 @@
     <w:p>
       <w:pPr>
         <w:pStyle w:val="ListBullet"/>
-        <w:spacing w:before="20" w:after="30"/>
-        <w:ind w:left="288"/>
+        <w:spacing w:before="20" w:after="30" w:line="259" w:lineRule="auto"/>
       </w:pPr>
       <w:r>
         <w:rPr>
-          <w:rFonts w:ascii="Calibri" w:hAnsi="Calibri"/>
+          <w:b/>
+          <w:color w:val="1E1E1E"/>
+          <w:sz w:val="19"/>
+        </w:rPr>
+        <w:t xml:space="preserve">Certificate Course in Market Research (60 Hours): </w:t>
+      </w:r>
+      <w:r>
+        <w:rPr>
+          <w:color w:val="1E1E1E"/>
+          <w:sz w:val="19"/>
+        </w:rPr>
+        <w:t>Reliance Foundation Skilling Academy &amp; Skill India Digital Hub (December 2025)</w:t>
+      </w:r>
+    </w:p>
+    <w:p>
+      <w:pPr>
+        <w:pStyle w:val="ListBullet"/>
+        <w:spacing w:before="20" w:after="30" w:line="259" w:lineRule="auto"/>
+      </w:pPr>
+      <w:r>
+        <w:rPr>
           <w:b/>
           <w:color w:val="1E1E1E"/>
           <w:sz w:val="19"/>
@@ -892,7 +796,6 @@
       </w:r>
       <w:r>
         <w:rPr>
-          <w:rFonts w:ascii="Calibri" w:hAnsi="Calibri"/>
           <w:color w:val="1E1E1E"/>
           <w:sz w:val="19"/>
         </w:rPr>
@@ -902,12 +805,10 @@
     <w:p>
       <w:pPr>
         <w:pStyle w:val="ListBullet"/>
-        <w:spacing w:before="20" w:after="30"/>
-        <w:ind w:left="288"/>
+        <w:spacing w:before="20" w:after="30" w:line="259" w:lineRule="auto"/>
       </w:pPr>
       <w:r>
         <w:rPr>
-          <w:rFonts w:ascii="Calibri" w:hAnsi="Calibri"/>
           <w:b/>
           <w:color w:val="1E1E1E"/>
           <w:sz w:val="19"/>
@@ -916,7 +817,6 @@
       </w:r>
       <w:r>
         <w:rPr>
-          <w:rFonts w:ascii="Calibri" w:hAnsi="Calibri"/>
           <w:color w:val="1E1E1E"/>
           <w:sz w:val="19"/>
         </w:rPr>
@@ -926,12 +826,10 @@
     <w:p>
       <w:pPr>
         <w:pStyle w:val="ListBullet"/>
-        <w:spacing w:before="20" w:after="30"/>
-        <w:ind w:left="288"/>
+        <w:spacing w:before="20" w:after="30" w:line="259" w:lineRule="auto"/>
       </w:pPr>
       <w:r>
         <w:rPr>
-          <w:rFonts w:ascii="Calibri" w:hAnsi="Calibri"/>
           <w:b/>
           <w:color w:val="1E1E1E"/>
           <w:sz w:val="19"/>
@@ -940,7 +838,6 @@
       </w:r>
       <w:r>
         <w:rPr>
-          <w:rFonts w:ascii="Calibri" w:hAnsi="Calibri"/>
           <w:color w:val="1E1E1E"/>
           <w:sz w:val="19"/>
         </w:rPr>
@@ -949,15 +846,13 @@
     </w:p>
     <w:p>
       <w:pPr>
-        <w:keepNext/>
-        <w:spacing w:before="120" w:after="40"/>
-        <w:pBrd>
-          <w:bottom w:val="single" w:sz="8" w:space="2" w:color="0F2C59"/>
-        </w:pBrd>
+        <w:spacing w:before="160" w:after="40"/>
+        <w:pBdr>
+          <w:bottom w:val="single" w:sz="6" w:space="1" w:color="0F2C59"/>
+        </w:pBdr>
       </w:pPr>
       <w:r>
         <w:rPr>
-          <w:rFonts w:ascii="Calibri" w:hAnsi="Calibri"/>
           <w:b/>
           <w:color w:val="0F2C59"/>
           <w:sz w:val="21"/>
@@ -967,12 +862,10 @@
     </w:p>
     <w:p>
       <w:pPr>
-        <w:keepNext/>
-        <w:spacing w:before="80" w:after="20"/>
+        <w:spacing w:before="60" w:after="20"/>
       </w:pPr>
       <w:r>
         <w:rPr>
-          <w:rFonts w:ascii="Calibri" w:hAnsi="Calibri"/>
           <w:b/>
           <w:color w:val="1E1E1E"/>
           <w:sz w:val="20"/>
@@ -982,13 +875,10 @@
     </w:p>
     <w:p>
       <w:pPr>
-        <w:keepNext/>
         <w:spacing w:before="0" w:after="40"/>
       </w:pPr>
       <w:r>
         <w:rPr>
-          <w:rFonts w:ascii="Calibri" w:hAnsi="Calibri"/>
-          <w:i/>
           <w:color w:val="464646"/>
           <w:sz w:val="17"/>
         </w:rPr>
@@ -1368,6 +1258,11 @@
     <w:name w:val="Normal"/>
     <w:qFormat/>
     <w:rsid w:val="00FC693F"/>
+    <w:rPr>
+      <w:rFonts w:ascii="Calibri" w:hAnsi="Calibri"/>
+      <w:color w:val="1E1E1E"/>
+      <w:sz w:val="19"/>
+    </w:rPr>
   </w:style>
   <w:style w:type="paragraph" w:styleId="Header">
     <w:name w:val="header"/>

</xml_diff>